<commit_message>
Auditoría contra el PDF del caso: consolida los supuestos explícitos
El código ya cubría las 17 reglas y el alcance completo. La brecha era de documentación: el README solo repetía la instrucción del caso de declarar supuestos, sin listarlos. Se agrega una tabla de 7 vacíos del caso con su supuesto adoptado y fundamento, en README.md y en el informe Word, y se pone al día el estado del informe (roles, pruebas, UML, despliegue, rediseño).

Co-Authored-By: Claude Sonnet 5 <noreply@anthropic.com>
</commit_message>
<xml_diff>
--- a/Informe_Viajes_Aventura.docx
+++ b/Informe_Viajes_Aventura.docx
@@ -1181,25 +1181,526 @@
         <w:spacing w:after="160"/>
       </w:pPr>
       <w:r>
-        <w:t xml:space="preserve">El caso no dice, por ejemplo, qué ocurre cuando un cliente desiste de una reserva, ni cómo se comporta un paquete cuando su temporada termina, ni quién puede modificar el catálogo. Cuando un dato no está disponible, el criterio es adoptar un supuesto explícito y fundamentarlo técnicamente.</w:t>
-      </w:r>
-    </w:p>
-    <w:p>
-      <w:pPr>
-        <w:pBdr>
-          <w:left w:val="single" w:color="999999" w:sz="12" w:space="8"/>
-        </w:pBdr>
-        <w:spacing w:after="160"/>
-      </w:pPr>
-      <w:r>
-        <w:rPr>
-          <w:i/>
-          <w:iCs/>
-          <w:color w:val="555555"/>
-        </w:rPr>
-        <w:t xml:space="preserve">Pendiente: completar la lista de supuestos adoptados a medida que se desarrolla cada dominio.</w:t>
-      </w:r>
-    </w:p>
+        <w:t xml:space="preserve">El caso no entrega toda la información necesaria para implementar el sistema. Cuando un dato no estaba disponible, el criterio fue adoptar un supuesto explícito y fundamentarlo técnicamente, en vez de dejarlo implícito en el código. El detalle técnico de cada uno está en el Cambio correspondiente de VALIDACION_IA.md.</w:t>
+      </w:r>
+    </w:p>
+    <w:tbl>
+      <w:tblPr>
+        <w:tblW w:type="dxa" w:w="9260"/>
+        <w:tblBorders>
+          <w:top w:val="single" w:color="auto" w:sz="4"/>
+          <w:left w:val="single" w:color="auto" w:sz="4"/>
+          <w:bottom w:val="single" w:color="auto" w:sz="4"/>
+          <w:right w:val="single" w:color="auto" w:sz="4"/>
+          <w:insideH w:val="single" w:color="auto" w:sz="4"/>
+          <w:insideV w:val="single" w:color="auto" w:sz="4"/>
+        </w:tblBorders>
+      </w:tblPr>
+      <w:tblGrid>
+        <w:gridCol w:w="2800"/>
+        <w:gridCol w:w="3500"/>
+        <w:gridCol w:w="2960"/>
+      </w:tblGrid>
+      <w:tr>
+        <w:tc>
+          <w:tcPr>
+            <w:tcW w:type="dxa" w:w="2800"/>
+            <w:shd w:fill="F2F2F2" w:val="clear"/>
+            <w:tcMar>
+              <w:top w:type="dxa" w:w="80"/>
+              <w:left w:type="dxa" w:w="100"/>
+              <w:bottom w:type="dxa" w:w="80"/>
+              <w:right w:type="dxa" w:w="100"/>
+            </w:tcMar>
+          </w:tcPr>
+          <w:p>
+            <w:r>
+              <w:rPr>
+                <w:b/>
+                <w:bCs/>
+              </w:rPr>
+              <w:t xml:space="preserve">Vacío del caso</w:t>
+            </w:r>
+          </w:p>
+        </w:tc>
+        <w:tc>
+          <w:tcPr>
+            <w:tcW w:type="dxa" w:w="3500"/>
+            <w:shd w:fill="F2F2F2" w:val="clear"/>
+            <w:tcMar>
+              <w:top w:type="dxa" w:w="80"/>
+              <w:left w:type="dxa" w:w="100"/>
+              <w:bottom w:type="dxa" w:w="80"/>
+              <w:right w:type="dxa" w:w="100"/>
+            </w:tcMar>
+          </w:tcPr>
+          <w:p>
+            <w:r>
+              <w:rPr>
+                <w:b/>
+                <w:bCs/>
+              </w:rPr>
+              <w:t xml:space="preserve">Supuesto adoptado</w:t>
+            </w:r>
+          </w:p>
+        </w:tc>
+        <w:tc>
+          <w:tcPr>
+            <w:tcW w:type="dxa" w:w="2960"/>
+            <w:shd w:fill="F2F2F2" w:val="clear"/>
+            <w:tcMar>
+              <w:top w:type="dxa" w:w="80"/>
+              <w:left w:type="dxa" w:w="100"/>
+              <w:bottom w:type="dxa" w:w="80"/>
+              <w:right w:type="dxa" w:w="100"/>
+            </w:tcMar>
+          </w:tcPr>
+          <w:p>
+            <w:r>
+              <w:rPr>
+                <w:b/>
+                <w:bCs/>
+              </w:rPr>
+              <w:t xml:space="preserve">Fundamento</w:t>
+            </w:r>
+          </w:p>
+        </w:tc>
+      </w:tr>
+      <w:tr>
+        <w:tc>
+          <w:tcPr>
+            <w:tcW w:type="dxa" w:w="2800"/>
+            <w:tcMar>
+              <w:top w:type="dxa" w:w="80"/>
+              <w:left w:type="dxa" w:w="100"/>
+              <w:bottom w:type="dxa" w:w="80"/>
+              <w:right w:type="dxa" w:w="100"/>
+            </w:tcMar>
+          </w:tcPr>
+          <w:p>
+            <w:r>
+              <w:rPr>
+                <w:b w:val="false"/>
+                <w:bCs w:val="false"/>
+              </w:rPr>
+              <w:t xml:space="preserve">¿Qué ocurre cuando un cliente desiste de una reserva?</w:t>
+            </w:r>
+          </w:p>
+        </w:tc>
+        <w:tc>
+          <w:tcPr>
+            <w:tcW w:type="dxa" w:w="3500"/>
+            <w:tcMar>
+              <w:top w:type="dxa" w:w="80"/>
+              <w:left w:type="dxa" w:w="100"/>
+              <w:bottom w:type="dxa" w:w="80"/>
+              <w:right w:type="dxa" w:w="100"/>
+            </w:tcMar>
+          </w:tcPr>
+          <w:p>
+            <w:r>
+              <w:rPr>
+                <w:b w:val="false"/>
+                <w:bCs w:val="false"/>
+              </w:rPr>
+              <w:t xml:space="preserve">No se implementa cancelación de reservas en esta versión.</w:t>
+            </w:r>
+          </w:p>
+        </w:tc>
+        <w:tc>
+          <w:tcPr>
+            <w:tcW w:type="dxa" w:w="2960"/>
+            <w:tcMar>
+              <w:top w:type="dxa" w:w="80"/>
+              <w:left w:type="dxa" w:w="100"/>
+              <w:bottom w:type="dxa" w:w="80"/>
+              <w:right w:type="dxa" w:w="100"/>
+            </w:tcMar>
+          </w:tcPr>
+          <w:p>
+            <w:r>
+              <w:rPr>
+                <w:b w:val="false"/>
+                <w:bCs w:val="false"/>
+              </w:rPr>
+              <w:t xml:space="preserve">El alcance (§4) define Reservas sin incluir cancelar.</w:t>
+            </w:r>
+          </w:p>
+        </w:tc>
+      </w:tr>
+      <w:tr>
+        <w:tc>
+          <w:tcPr>
+            <w:tcW w:type="dxa" w:w="2800"/>
+            <w:tcMar>
+              <w:top w:type="dxa" w:w="80"/>
+              <w:left w:type="dxa" w:w="100"/>
+              <w:bottom w:type="dxa" w:w="80"/>
+              <w:right w:type="dxa" w:w="100"/>
+            </w:tcMar>
+          </w:tcPr>
+          <w:p>
+            <w:r>
+              <w:rPr>
+                <w:b w:val="false"/>
+                <w:bCs w:val="false"/>
+              </w:rPr>
+              <w:t xml:space="preserve">¿Cómo se comporta un paquete cuando su "temporada" termina?</w:t>
+            </w:r>
+          </w:p>
+        </w:tc>
+        <w:tc>
+          <w:tcPr>
+            <w:tcW w:type="dxa" w:w="3500"/>
+            <w:tcMar>
+              <w:top w:type="dxa" w:w="80"/>
+              <w:left w:type="dxa" w:w="100"/>
+              <w:bottom w:type="dxa" w:w="80"/>
+              <w:right w:type="dxa" w:w="100"/>
+            </w:tcMar>
+          </w:tcPr>
+          <w:p>
+            <w:r>
+              <w:rPr>
+                <w:b w:val="false"/>
+                <w:bCs w:val="false"/>
+              </w:rPr>
+              <w:t xml:space="preserve">No existe un estado de "temporada terminada": R5 usa fecha_salida/fecha_regreso concretas, y R15 ya impide reservar un paquete con fecha_salida vencida.</w:t>
+            </w:r>
+          </w:p>
+        </w:tc>
+        <w:tc>
+          <w:tcPr>
+            <w:tcW w:type="dxa" w:w="2960"/>
+            <w:tcMar>
+              <w:top w:type="dxa" w:w="80"/>
+              <w:left w:type="dxa" w:w="100"/>
+              <w:bottom w:type="dxa" w:w="80"/>
+              <w:right w:type="dxa" w:w="100"/>
+            </w:tcMar>
+          </w:tcPr>
+          <w:p>
+            <w:r>
+              <w:rPr>
+                <w:b w:val="false"/>
+                <w:bCs w:val="false"/>
+              </w:rPr>
+              <w:t xml:space="preserve">R5, R15.</w:t>
+            </w:r>
+          </w:p>
+        </w:tc>
+      </w:tr>
+      <w:tr>
+        <w:tc>
+          <w:tcPr>
+            <w:tcW w:type="dxa" w:w="2800"/>
+            <w:tcMar>
+              <w:top w:type="dxa" w:w="80"/>
+              <w:left w:type="dxa" w:w="100"/>
+              <w:bottom w:type="dxa" w:w="80"/>
+              <w:right w:type="dxa" w:w="100"/>
+            </w:tcMar>
+          </w:tcPr>
+          <w:p>
+            <w:r>
+              <w:rPr>
+                <w:b w:val="false"/>
+                <w:bCs w:val="false"/>
+              </w:rPr>
+              <w:t xml:space="preserve">¿Quién puede modificar el catálogo?</w:t>
+            </w:r>
+          </w:p>
+        </w:tc>
+        <w:tc>
+          <w:tcPr>
+            <w:tcW w:type="dxa" w:w="3500"/>
+            <w:tcMar>
+              <w:top w:type="dxa" w:w="80"/>
+              <w:left w:type="dxa" w:w="100"/>
+              <w:bottom w:type="dxa" w:w="80"/>
+              <w:right w:type="dxa" w:w="100"/>
+            </w:tcMar>
+          </w:tcPr>
+          <w:p>
+            <w:r>
+              <w:rPr>
+                <w:b w:val="false"/>
+                <w:bCs w:val="false"/>
+              </w:rPr>
+              <w:t xml:space="preserve">Un único administrador (un solo socio a cargo, §1.3), autenticado aparte de los clientes. El catálogo de lectura sigue siendo público.</w:t>
+            </w:r>
+          </w:p>
+        </w:tc>
+        <w:tc>
+          <w:tcPr>
+            <w:tcW w:type="dxa" w:w="2960"/>
+            <w:tcMar>
+              <w:top w:type="dxa" w:w="80"/>
+              <w:left w:type="dxa" w:w="100"/>
+              <w:bottom w:type="dxa" w:w="80"/>
+              <w:right w:type="dxa" w:w="100"/>
+            </w:tcMar>
+          </w:tcPr>
+          <w:p>
+            <w:r>
+              <w:rPr>
+                <w:b w:val="false"/>
+                <w:bCs w:val="false"/>
+              </w:rPr>
+              <w:t xml:space="preserve">Rol de administrador (JWT).</w:t>
+            </w:r>
+          </w:p>
+        </w:tc>
+      </w:tr>
+      <w:tr>
+        <w:tc>
+          <w:tcPr>
+            <w:tcW w:type="dxa" w:w="2800"/>
+            <w:tcMar>
+              <w:top w:type="dxa" w:w="80"/>
+              <w:left w:type="dxa" w:w="100"/>
+              <w:bottom w:type="dxa" w:w="80"/>
+              <w:right w:type="dxa" w:w="100"/>
+            </w:tcMar>
+          </w:tcPr>
+          <w:p>
+            <w:r>
+              <w:rPr>
+                <w:b w:val="false"/>
+                <w:bCs w:val="false"/>
+              </w:rPr>
+              <w:t xml:space="preserve">¿Se puede reservar un paquete no publicado?</w:t>
+            </w:r>
+          </w:p>
+        </w:tc>
+        <w:tc>
+          <w:tcPr>
+            <w:tcW w:type="dxa" w:w="3500"/>
+            <w:tcMar>
+              <w:top w:type="dxa" w:w="80"/>
+              <w:left w:type="dxa" w:w="100"/>
+              <w:bottom w:type="dxa" w:w="80"/>
+              <w:right w:type="dxa" w:w="100"/>
+            </w:tcMar>
+          </w:tcPr>
+          <w:p>
+            <w:r>
+              <w:rPr>
+                <w:b w:val="false"/>
+                <w:bCs w:val="false"/>
+              </w:rPr>
+              <w:t xml:space="preserve">No: sin publicar, el precio aún no está fijado (R7) y es un borrador editable.</w:t>
+            </w:r>
+          </w:p>
+        </w:tc>
+        <w:tc>
+          <w:tcPr>
+            <w:tcW w:type="dxa" w:w="2960"/>
+            <w:tcMar>
+              <w:top w:type="dxa" w:w="80"/>
+              <w:left w:type="dxa" w:w="100"/>
+              <w:bottom w:type="dxa" w:w="80"/>
+              <w:right w:type="dxa" w:w="100"/>
+            </w:tcMar>
+          </w:tcPr>
+          <w:p>
+            <w:r>
+              <w:rPr>
+                <w:b w:val="false"/>
+                <w:bCs w:val="false"/>
+              </w:rPr>
+              <w:t xml:space="preserve">R7.</w:t>
+            </w:r>
+          </w:p>
+        </w:tc>
+      </w:tr>
+      <w:tr>
+        <w:tc>
+          <w:tcPr>
+            <w:tcW w:type="dxa" w:w="2800"/>
+            <w:tcMar>
+              <w:top w:type="dxa" w:w="80"/>
+              <w:left w:type="dxa" w:w="100"/>
+              <w:bottom w:type="dxa" w:w="80"/>
+              <w:right w:type="dxa" w:w="100"/>
+            </w:tcMar>
+          </w:tcPr>
+          <w:p>
+            <w:r>
+              <w:rPr>
+                <w:b w:val="false"/>
+                <w:bCs w:val="false"/>
+              </w:rPr>
+              <w:t xml:space="preserve">¿Se puede editar o eliminar un paquete ya creado?</w:t>
+            </w:r>
+          </w:p>
+        </w:tc>
+        <w:tc>
+          <w:tcPr>
+            <w:tcW w:type="dxa" w:w="3500"/>
+            <w:tcMar>
+              <w:top w:type="dxa" w:w="80"/>
+              <w:left w:type="dxa" w:w="100"/>
+              <w:bottom w:type="dxa" w:w="80"/>
+              <w:right w:type="dxa" w:w="100"/>
+            </w:tcMar>
+          </w:tcPr>
+          <w:p>
+            <w:r>
+              <w:rPr>
+                <w:b w:val="false"/>
+                <w:bCs w:val="false"/>
+              </w:rPr>
+              <w:t xml:space="preserve">No: el alcance (§4) para Paquetes no incluye modificar ni eliminar, solo crear, calcular precio y consultar disponibilidad.</w:t>
+            </w:r>
+          </w:p>
+        </w:tc>
+        <w:tc>
+          <w:tcPr>
+            <w:tcW w:type="dxa" w:w="2960"/>
+            <w:tcMar>
+              <w:top w:type="dxa" w:w="80"/>
+              <w:left w:type="dxa" w:w="100"/>
+              <w:bottom w:type="dxa" w:w="80"/>
+              <w:right w:type="dxa" w:w="100"/>
+            </w:tcMar>
+          </w:tcPr>
+          <w:p>
+            <w:r>
+              <w:rPr>
+                <w:b w:val="false"/>
+                <w:bCs w:val="false"/>
+              </w:rPr>
+              <w:t xml:space="preserve">Alcance §4.</w:t>
+            </w:r>
+          </w:p>
+        </w:tc>
+      </w:tr>
+      <w:tr>
+        <w:tc>
+          <w:tcPr>
+            <w:tcW w:type="dxa" w:w="2800"/>
+            <w:tcMar>
+              <w:top w:type="dxa" w:w="80"/>
+              <w:left w:type="dxa" w:w="100"/>
+              <w:bottom w:type="dxa" w:w="80"/>
+              <w:right w:type="dxa" w:w="100"/>
+            </w:tcMar>
+          </w:tcPr>
+          <w:p>
+            <w:r>
+              <w:rPr>
+                <w:b w:val="false"/>
+                <w:bCs w:val="false"/>
+              </w:rPr>
+              <w:t xml:space="preserve">¿Qué formato debe tener el RUT?</w:t>
+            </w:r>
+          </w:p>
+        </w:tc>
+        <w:tc>
+          <w:tcPr>
+            <w:tcW w:type="dxa" w:w="3500"/>
+            <w:tcMar>
+              <w:top w:type="dxa" w:w="80"/>
+              <w:left w:type="dxa" w:w="100"/>
+              <w:bottom w:type="dxa" w:w="80"/>
+              <w:right w:type="dxa" w:w="100"/>
+            </w:tcMar>
+          </w:tcPr>
+          <w:p>
+            <w:r>
+              <w:rPr>
+                <w:b w:val="false"/>
+                <w:bCs w:val="false"/>
+              </w:rPr>
+              <w:t xml:space="preserve">Se valida formato y dígito verificador con el algoritmo módulo 11 chileno.</w:t>
+            </w:r>
+          </w:p>
+        </w:tc>
+        <w:tc>
+          <w:tcPr>
+            <w:tcW w:type="dxa" w:w="2960"/>
+            <w:tcMar>
+              <w:top w:type="dxa" w:w="80"/>
+              <w:left w:type="dxa" w:w="100"/>
+              <w:bottom w:type="dxa" w:w="80"/>
+              <w:right w:type="dxa" w:w="100"/>
+            </w:tcMar>
+          </w:tcPr>
+          <w:p>
+            <w:r>
+              <w:rPr>
+                <w:b w:val="false"/>
+                <w:bCs w:val="false"/>
+              </w:rPr>
+              <w:t xml:space="preserve">R9.</w:t>
+            </w:r>
+          </w:p>
+        </w:tc>
+      </w:tr>
+      <w:tr>
+        <w:tc>
+          <w:tcPr>
+            <w:tcW w:type="dxa" w:w="2800"/>
+            <w:tcMar>
+              <w:top w:type="dxa" w:w="80"/>
+              <w:left w:type="dxa" w:w="100"/>
+              <w:bottom w:type="dxa" w:w="80"/>
+              <w:right w:type="dxa" w:w="100"/>
+            </w:tcMar>
+          </w:tcPr>
+          <w:p>
+            <w:r>
+              <w:rPr>
+                <w:b w:val="false"/>
+                <w:bCs w:val="false"/>
+              </w:rPr>
+              <w:t xml:space="preserve">¿El catálogo requiere sesión para consultarse?</w:t>
+            </w:r>
+          </w:p>
+        </w:tc>
+        <w:tc>
+          <w:tcPr>
+            <w:tcW w:type="dxa" w:w="3500"/>
+            <w:tcMar>
+              <w:top w:type="dxa" w:w="80"/>
+              <w:left w:type="dxa" w:w="100"/>
+              <w:bottom w:type="dxa" w:w="80"/>
+              <w:right w:type="dxa" w:w="100"/>
+            </w:tcMar>
+          </w:tcPr>
+          <w:p>
+            <w:r>
+              <w:rPr>
+                <w:b w:val="false"/>
+                <w:bCs w:val="false"/>
+              </w:rPr>
+              <w:t xml:space="preserve">No: el cliente consulta paquetes disponibles antes de registrarse (§1.3); solo reservar y ver el historial propio requieren sesión.</w:t>
+            </w:r>
+          </w:p>
+        </w:tc>
+        <w:tc>
+          <w:tcPr>
+            <w:tcW w:type="dxa" w:w="2960"/>
+            <w:tcMar>
+              <w:top w:type="dxa" w:w="80"/>
+              <w:left w:type="dxa" w:w="100"/>
+              <w:bottom w:type="dxa" w:w="80"/>
+              <w:right w:type="dxa" w:w="100"/>
+            </w:tcMar>
+          </w:tcPr>
+          <w:p>
+            <w:r>
+              <w:rPr>
+                <w:b w:val="false"/>
+                <w:bCs w:val="false"/>
+              </w:rPr>
+              <w:t xml:space="preserve">R11.</w:t>
+            </w:r>
+          </w:p>
+        </w:tc>
+      </w:tr>
+    </w:tbl>
     <w:p>
       <w:r>
         <w:br w:type="page"/>
@@ -1235,7 +1736,7 @@
         <w:spacing w:after="160"/>
       </w:pPr>
       <w:r>
-        <w:t xml:space="preserve">Persistencia con sqlite3 de la librería estándar: esquema de 5 tablas (destinos, paquetes, paquete_destinos, clientes, reservas) con sus claves foráneas y restricciones CHECK que expresan las reglas de negocio a nivel de columna. Autenticación planificada con JWT y contraseñas hasheadas (passlib/bcrypt) para cumplir R9-R11 y R17.</w:t>
+        <w:t xml:space="preserve">Persistencia con sqlite3 de la librería estándar: esquema de 5 tablas (destinos, paquetes, paquete_destinos, clientes, reservas) con sus claves foráneas y restricciones CHECK que expresan las reglas de negocio a nivel de columna. Autenticación con JWT y contraseñas hasheadas con bcrypt para cumplir R9-R11 y R17.</w:t>
       </w:r>
     </w:p>
     <w:p>
@@ -1244,6 +1745,22 @@
       </w:pPr>
       <w:r>
         <w:t xml:space="preserve">Durante el desarrollo, backend y frontend corren como dos procesos separados (proxy de Vite hacia el backend). Para la entrega, el frontend se compila a backend/static/ y FastAPI lo sirve como archivos estáticos, quedando un solo servidor y un solo puerto.</w:t>
+      </w:r>
+    </w:p>
+    <w:p>
+      <w:pPr>
+        <w:spacing w:after="160"/>
+      </w:pPr>
+      <w:r>
+        <w:t xml:space="preserve">Roles y autorización: el JWT incluye un claim "rol" (cliente o admin). El cliente solo puede reservar y ver sus propias reservas (R11). El administrador es único (el caso describe un solo socio a cargo, §1.3), con credenciales por variable de entorno en vez de una tabla, y es el único que puede crear, editar o eliminar destinos y crear/publicar paquetes; el catálogo de lectura sigue siendo público.</w:t>
+      </w:r>
+    </w:p>
+    <w:p>
+      <w:pPr>
+        <w:spacing w:after="160"/>
+      </w:pPr>
+      <w:r>
+        <w:t xml:space="preserve">Calidad: 37 pruebas automatizadas (pytest + TestClient de FastAPI) cubren las 17 reglas de negocio y la separación de roles, cada una contra una base SQLite temporal aislada. El modelo UML de clases del dominio está documentado en docs/modelo-uml.md (diagrama Mermaid, renderizado directo en GitHub).</w:t>
       </w:r>
     </w:p>
     <w:p>
@@ -1608,7 +2125,7 @@
         <w:spacing w:after="160"/>
       </w:pPr>
       <w:r>
-        <w:t xml:space="preserve">Esqueleto base listo y probado (backend + frontend + esquema SQLite + servidor único de entrega). Dominio Destinos (R1, R2, R8) implementado: CRUD completo, catálogo y regla de baja lógica cuando el destino está en uso.</w:t>
+        <w:t xml:space="preserve">Los 4 dominios del plan de trabajo (§7) están implementados y probados de punta a punta: Destinos (R1, R2, R8), Paquetes (R3-R7), Clientes y seguridad (R9, R10, R11, R17) y Reservas (R12-R16), con las 17 reglas de negocio cubiertas. Además: rol de administrador separado del de cliente, 37 pruebas automatizadas, modelo UML del dominio, despliegue en Render con auto-deploy, y un rediseño visual del frontend (paleta de color, tarjetas, badges de estado, tablas responsivas).</w:t>
       </w:r>
     </w:p>
     <w:p>
@@ -1616,7 +2133,7 @@
         <w:spacing w:after="160"/>
       </w:pPr>
       <w:r>
-        <w:t xml:space="preserve">Pendiente: dominios Paquetes, Clientes y seguridad, y Reservas; autenticación JWT; modelo UML formal; pruebas automatizadas.</w:t>
+        <w:t xml:space="preserve">Pendiente: ajustar la estructura de este informe cuando se conozca la guía oficial de evaluación; más pruebas de integración end-to-end desde el frontend, si el tiempo alcanza.</w:t>
       </w:r>
     </w:p>
     <w:p>

</xml_diff>

<commit_message>
Pone al día el informe Word: 43 pruebas, fix de concurrencia y SonarCloud limpio
El informe seguía con los números del Cambio 14 (37 pruebas). Actualiza §6 y §8 con el estado real: 43 pruebas automatizadas (incluida la de concurrencia sobre R14), el fix con BEGIN IMMEDIATE, el segundo rediseño del frontend, y el Quality Gate de SonarCloud en OK sin hallazgos.

Co-Authored-By: Claude Sonnet 5 <noreply@anthropic.com>
</commit_message>
<xml_diff>
--- a/Informe_Viajes_Aventura.docx
+++ b/Informe_Viajes_Aventura.docx
@@ -1760,7 +1760,7 @@
         <w:spacing w:after="160"/>
       </w:pPr>
       <w:r>
-        <w:t xml:space="preserve">Calidad: 37 pruebas automatizadas (pytest + TestClient de FastAPI) cubren las 17 reglas de negocio y la separación de roles, cada una contra una base SQLite temporal aislada. El modelo UML de clases del dominio está documentado en docs/modelo-uml.md (diagrama Mermaid, renderizado directo en GitHub).</w:t>
+        <w:t xml:space="preserve">Calidad: 43 pruebas automatizadas (pytest + TestClient de FastAPI) cubren las 17 reglas de negocio, la separación de roles y una prueba de concurrencia (dos reservas simultáneas con threading.Thread) que confirma que no se puede sobrevender el cupo de un paquete, cada una contra una base SQLite temporal aislada. La creación de una reserva corre dentro de una transacción BEGIN IMMEDIATE para evitar esa condición de carrera en R14. El modelo UML de clases del dominio está documentado en docs/modelo-uml.md (diagrama Mermaid, renderizado directo en GitHub). El repositorio está conectado a SonarCloud (análisis automático en cada push): Quality Gate en OK, 0 bugs, 0 vulnerabilidades, 0 code smells y 0 security hotspots.</w:t>
       </w:r>
     </w:p>
     <w:p>
@@ -2125,7 +2125,7 @@
         <w:spacing w:after="160"/>
       </w:pPr>
       <w:r>
-        <w:t xml:space="preserve">Los 4 dominios del plan de trabajo (§7) están implementados y probados de punta a punta: Destinos (R1, R2, R8), Paquetes (R3-R7), Clientes y seguridad (R9, R10, R11, R17) y Reservas (R12-R16), con las 17 reglas de negocio cubiertas. Además: rol de administrador separado del de cliente, 37 pruebas automatizadas, modelo UML del dominio, despliegue en Render con auto-deploy, y un rediseño visual del frontend (paleta de color, tarjetas, badges de estado, tablas responsivas).</w:t>
+        <w:t xml:space="preserve">Los 4 dominios del plan de trabajo (§7) están implementados y probados de punta a punta: Destinos (R1, R2, R8), Paquetes (R3-R7), Clientes y seguridad (R9, R10, R11, R17) y Reservas (R12-R16), con las 17 reglas de negocio cubiertas. Además: rol de administrador separado del de cliente, 43 pruebas automatizadas (incluida una de concurrencia sobre el cupo de Reservas), modelo UML del dominio, despliegue en Render con auto-deploy, un frontend con navegación por pestañas y modo oscuro automático, y un análisis estático continuo con SonarCloud sin hallazgos abiertos (0 bugs, 0 vulnerabilidades, 0 code smells).</w:t>
       </w:r>
     </w:p>
     <w:p>

</xml_diff>